<commit_message>
Revert "Merge branch 'main' of https://github.com/erkhes2025603-lang/erkhes2025603.github.io"
This reverts commit bca8bbd47cbb691ef5d91a1410f3b4014f35a1c2, reversing
changes made to 70a879948b0c792990cf90712999b47bc6950edd.
</commit_message>
<xml_diff>
--- a/PRD (1).docx
+++ b/PRD (1).docx
@@ -206,9 +206,11 @@
             </w:pPr>
             <w:r>
               <w:rPr>
-                <w:color w:val="A6A6A6" w:themeColor="background1" w:themeShade="A6"/>
-              </w:rPr>
-              <w:t>DevStrength Fitness</w:t>
+                <w:i/>
+                <w:iCs/>
+                <w:color w:val="A6A6A6" w:themeColor="background1" w:themeShade="A6"/>
+              </w:rPr>
+              <w:t>Enter your website or project name</w:t>
             </w:r>
           </w:p>
         </w:tc>
@@ -271,7 +273,7 @@
                 <w:iCs/>
                 <w:color w:val="A6A6A6" w:themeColor="background1" w:themeShade="A6"/>
               </w:rPr>
-              <w:t>Group 3</w:t>
+              <w:t>e.g., Group 4 — The Web Wizards</w:t>
             </w:r>
           </w:p>
         </w:tc>
@@ -690,7 +692,7 @@
                 <w:iCs/>
                 <w:color w:val="A6A6A6" w:themeColor="background1" w:themeShade="A6"/>
               </w:rPr>
-              <w:t>DevStrength</w:t>
+              <w:t>Enter website name</w:t>
             </w:r>
           </w:p>
         </w:tc>
@@ -749,9 +751,11 @@
             </w:pPr>
             <w:r>
               <w:rPr>
-                <w:color w:val="A6A6A6" w:themeColor="background1" w:themeShade="A6"/>
-              </w:rPr>
-              <w:t>Gym website</w:t>
+                <w:i/>
+                <w:iCs/>
+                <w:color w:val="A6A6A6" w:themeColor="background1" w:themeShade="A6"/>
+              </w:rPr>
+              <w:t>e.g., Portfolio / Blog / Small Business / Event / Non-profit</w:t>
             </w:r>
           </w:p>
         </w:tc>

</xml_diff>